<commit_message>
docx: add the documentation items that were still missing (user 2026-06-21)
The plain-English guide had the recent feature changes but not the three
Documentation requirements in full. Added:
  - RULES + THRESHOLDS: a proper table with the actual numbers (prior trend,
    H1>H2>H3, L1<L2<L3, squeeze >=30%, fresh <=60 bars, R:R >=3:1 tradeable gate,
    quality >=70 publish gate) — replacing the plain bullet list.
  - AMP1 explained: a "How far it could go — the target (AMP1)" section (funnel
    height = first high minus first low; target = full AMP1 from the midpoint;
    entry/stop/target and how R:R is derived).
  - The WEIGHTING CALCULATION: a "How the ranking is calculated" section spelling
    out the three-part sort (R:R, then readiness, then quality) and that the same
    recipe orders every list.

Rebuilt the docx (force-added; verified all new content present).

Co-Authored-By: Claude Opus 4.8 <noreply@anthropic.com>
</commit_message>
<xml_diff>
--- a/docs/How_The_Trading_System_Works_PlainEnglish.docx
+++ b/docs/How_The_Trading_System_Works_PlainEnglish.docx
@@ -199,10 +199,42 @@
     </w:p>
     <w:p>
       <w:pPr>
+        <w:pStyle w:val="Heading2"/>
+      </w:pPr>
+      <w:r>
+        <w:t xml:space="preserve">How far it could go — the target (AMP1)</w:t>
+      </w:r>
+    </w:p>
+    <w:p>
+      <w:pPr>
+        <w:spacing w:after="140"/>
+      </w:pPr>
+      <w:r>
+        <w:rPr>
+          <w:sz w:val="22"/>
+          <w:szCs w:val="22"/>
+        </w:rPr>
+        <w:t xml:space="preserve">Every funnel has a height: the distance from the first high to the first low of the squeeze. The method calls this the amplitude, or AMP1 (you can see it marked on the picture above). When the spring releases, the system projects that FULL height from the middle of the funnel, in the breakout direction, to set the target. It uses the full amplitude — not a watered-down version — which is deliberate, and it is why some setups show a large reward-to-risk.</w:t>
+      </w:r>
+    </w:p>
+    <w:p>
+      <w:pPr>
+        <w:spacing w:after="140"/>
+      </w:pPr>
+      <w:r>
+        <w:rPr>
+          <w:sz w:val="22"/>
+          <w:szCs w:val="22"/>
+        </w:rPr>
+        <w:t xml:space="preserve">So the three trade levels come straight from the funnel: the entry is the breakout level itself (the third pivot); the safety exit (stop) sits just beyond the opposite side of the funnel; and the target is one full AMP1 away from the middle. Reward-to-risk is then simply the distance to the target divided by the distance to the stop.</w:t>
+      </w:r>
+    </w:p>
+    <w:p>
+      <w:pPr>
         <w:pStyle w:val="Heading1"/>
       </w:pPr>
       <w:r>
-        <w:t xml:space="preserve">3. What has to be true before a setup is flagged</w:t>
+        <w:t xml:space="preserve">3. The rules and their thresholds</w:t>
       </w:r>
     </w:p>
     <w:p>
@@ -214,104 +246,507 @@
           <w:sz w:val="22"/>
           <w:szCs w:val="22"/>
         </w:rPr>
-        <w:t xml:space="preserve">Not every wobble counts. A setup must pass five plain checks before the system treats it as real:</w:t>
-      </w:r>
-    </w:p>
-    <w:p>
-      <w:pPr>
-        <w:pStyle w:val="ListParagraph"/>
-        <w:numPr>
-          <w:ilvl w:val="0"/>
-          <w:numId w:val="2"/>
-        </w:numPr>
-        <w:spacing w:after="80"/>
-      </w:pPr>
-      <w:r>
-        <w:rPr>
-          <w:sz w:val="22"/>
-          <w:szCs w:val="22"/>
-        </w:rPr>
-        <w:t xml:space="preserve">A clear prior trend — the market must have been moving decisively first. No trend, no setup.</w:t>
-      </w:r>
-    </w:p>
-    <w:p>
-      <w:pPr>
-        <w:pStyle w:val="ListParagraph"/>
-        <w:numPr>
-          <w:ilvl w:val="0"/>
-          <w:numId w:val="2"/>
-        </w:numPr>
-        <w:spacing w:after="80"/>
-      </w:pPr>
-      <w:r>
-        <w:rPr>
-          <w:sz w:val="22"/>
-          <w:szCs w:val="22"/>
-        </w:rPr>
-        <w:t xml:space="preserve">Falling highs — each peak is lower than the last (the ceiling is coming down).</w:t>
-      </w:r>
-    </w:p>
-    <w:p>
-      <w:pPr>
-        <w:pStyle w:val="ListParagraph"/>
-        <w:numPr>
-          <w:ilvl w:val="0"/>
-          <w:numId w:val="2"/>
-        </w:numPr>
-        <w:spacing w:after="80"/>
-      </w:pPr>
-      <w:r>
-        <w:rPr>
-          <w:sz w:val="22"/>
-          <w:szCs w:val="22"/>
-        </w:rPr>
-        <w:t xml:space="preserve">Rising lows — each dip is higher than the last (the floor is coming up).</w:t>
-      </w:r>
-    </w:p>
-    <w:p>
-      <w:pPr>
-        <w:pStyle w:val="ListParagraph"/>
-        <w:numPr>
-          <w:ilvl w:val="0"/>
-          <w:numId w:val="2"/>
-        </w:numPr>
-        <w:spacing w:after="80"/>
-      </w:pPr>
-      <w:r>
-        <w:rPr>
-          <w:sz w:val="22"/>
-          <w:szCs w:val="22"/>
-        </w:rPr>
-        <w:t xml:space="preserve">A real squeeze — the funnel must have tightened by at least a third from where it began.</w:t>
-      </w:r>
-    </w:p>
-    <w:p>
-      <w:pPr>
-        <w:pStyle w:val="ListParagraph"/>
-        <w:numPr>
-          <w:ilvl w:val="0"/>
-          <w:numId w:val="2"/>
-        </w:numPr>
-        <w:spacing w:after="80"/>
-      </w:pPr>
-      <w:r>
-        <w:rPr>
-          <w:sz w:val="22"/>
-          <w:szCs w:val="22"/>
-        </w:rPr>
-        <w:t xml:space="preserve">Freshness — the breakout point must be recent, not weeks stale.</w:t>
-      </w:r>
-    </w:p>
-    <w:p>
-      <w:pPr>
-        <w:spacing w:after="140"/>
-      </w:pPr>
-      <w:r>
-        <w:rPr>
-          <w:sz w:val="22"/>
-          <w:szCs w:val="22"/>
-        </w:rPr>
-        <w:t xml:space="preserve">Only when all five are true does the system measure up the trade. There is also a final money check: the potential reward must be at least three times the amount being risked (more on that next). If it is not, the idea goes on a watch-list rather than being recommended.</w:t>
+        <w:t xml:space="preserve">Not every wobble counts. A setup must pass five checks before the system treats it as real, then clear two more gates to be traded and published. The exact thresholds are below — these are the actual numbers the system uses, not approximations:</w:t>
+      </w:r>
+    </w:p>
+    <w:tbl>
+      <w:tblPr>
+        <w:tblW w:type="dxa" w:w="9360"/>
+        <w:tblBorders>
+          <w:top w:val="single" w:color="auto" w:sz="4"/>
+          <w:left w:val="single" w:color="auto" w:sz="4"/>
+          <w:bottom w:val="single" w:color="auto" w:sz="4"/>
+          <w:right w:val="single" w:color="auto" w:sz="4"/>
+          <w:insideH w:val="single" w:color="auto" w:sz="4"/>
+          <w:insideV w:val="single" w:color="auto" w:sz="4"/>
+        </w:tblBorders>
+      </w:tblPr>
+      <w:tblGrid>
+        <w:gridCol w:w="2400"/>
+        <w:gridCol w:w="6960"/>
+      </w:tblGrid>
+      <w:tr>
+        <w:trPr>
+          <w:tblHeader/>
+        </w:trPr>
+        <w:tc>
+          <w:tcPr>
+            <w:tcW w:type="dxa" w:w="2400"/>
+            <w:tcBorders>
+              <w:top w:val="single" w:color="DDDDDD" w:sz="1"/>
+              <w:left w:val="single" w:color="DDDDDD" w:sz="1"/>
+              <w:bottom w:val="single" w:color="DDDDDD" w:sz="1"/>
+              <w:right w:val="single" w:color="DDDDDD" w:sz="1"/>
+            </w:tcBorders>
+            <w:shd w:fill="2E5BBA" w:val="clear"/>
+            <w:tcMar>
+              <w:top w:type="dxa" w:w="70"/>
+              <w:left w:type="dxa" w:w="120"/>
+              <w:bottom w:type="dxa" w:w="70"/>
+              <w:right w:type="dxa" w:w="120"/>
+            </w:tcMar>
+          </w:tcPr>
+          <w:p>
+            <w:r>
+              <w:rPr>
+                <w:b/>
+                <w:bCs/>
+                <w:color w:val="FFFFFF"/>
+                <w:sz w:val="20"/>
+                <w:szCs w:val="20"/>
+              </w:rPr>
+              <w:t xml:space="preserve">Rule</w:t>
+            </w:r>
+          </w:p>
+        </w:tc>
+        <w:tc>
+          <w:tcPr>
+            <w:tcW w:type="dxa" w:w="6960"/>
+            <w:tcBorders>
+              <w:top w:val="single" w:color="DDDDDD" w:sz="1"/>
+              <w:left w:val="single" w:color="DDDDDD" w:sz="1"/>
+              <w:bottom w:val="single" w:color="DDDDDD" w:sz="1"/>
+              <w:right w:val="single" w:color="DDDDDD" w:sz="1"/>
+            </w:tcBorders>
+            <w:shd w:fill="2E5BBA" w:val="clear"/>
+            <w:tcMar>
+              <w:top w:type="dxa" w:w="70"/>
+              <w:left w:type="dxa" w:w="120"/>
+              <w:bottom w:type="dxa" w:w="70"/>
+              <w:right w:type="dxa" w:w="120"/>
+            </w:tcMar>
+          </w:tcPr>
+          <w:p>
+            <w:r>
+              <w:rPr>
+                <w:b/>
+                <w:bCs/>
+                <w:color w:val="FFFFFF"/>
+                <w:sz w:val="20"/>
+                <w:szCs w:val="20"/>
+              </w:rPr>
+              <w:t xml:space="preserve">Threshold — what must be true</w:t>
+            </w:r>
+          </w:p>
+        </w:tc>
+      </w:tr>
+      <w:tr>
+        <w:tc>
+          <w:tcPr>
+            <w:tcW w:type="dxa" w:w="2400"/>
+            <w:tcBorders>
+              <w:top w:val="single" w:color="DDDDDD" w:sz="1"/>
+              <w:left w:val="single" w:color="DDDDDD" w:sz="1"/>
+              <w:bottom w:val="single" w:color="DDDDDD" w:sz="1"/>
+              <w:right w:val="single" w:color="DDDDDD" w:sz="1"/>
+            </w:tcBorders>
+            <w:shd w:fill="F2F6FC" w:val="clear"/>
+            <w:tcMar>
+              <w:top w:type="dxa" w:w="70"/>
+              <w:left w:type="dxa" w:w="120"/>
+              <w:bottom w:type="dxa" w:w="70"/>
+              <w:right w:type="dxa" w:w="120"/>
+            </w:tcMar>
+          </w:tcPr>
+          <w:p>
+            <w:r>
+              <w:rPr>
+                <w:b/>
+                <w:bCs/>
+                <w:sz w:val="20"/>
+                <w:szCs w:val="20"/>
+              </w:rPr>
+              <w:t xml:space="preserve">1. Prior trend</w:t>
+            </w:r>
+          </w:p>
+        </w:tc>
+        <w:tc>
+          <w:tcPr>
+            <w:tcW w:type="dxa" w:w="6960"/>
+            <w:tcBorders>
+              <w:top w:val="single" w:color="DDDDDD" w:sz="1"/>
+              <w:left w:val="single" w:color="DDDDDD" w:sz="1"/>
+              <w:bottom w:val="single" w:color="DDDDDD" w:sz="1"/>
+              <w:right w:val="single" w:color="DDDDDD" w:sz="1"/>
+            </w:tcBorders>
+            <w:shd w:fill="F2F6FC" w:val="clear"/>
+            <w:tcMar>
+              <w:top w:type="dxa" w:w="70"/>
+              <w:left w:type="dxa" w:w="120"/>
+              <w:bottom w:type="dxa" w:w="70"/>
+              <w:right w:type="dxa" w:w="120"/>
+            </w:tcMar>
+          </w:tcPr>
+          <w:p>
+            <w:r>
+              <w:rPr>
+                <w:sz w:val="20"/>
+                <w:szCs w:val="20"/>
+              </w:rPr>
+              <w:t xml:space="preserve">A confirmed weekly trend in the trade's direction (up for a bullish funnel, down for bearish). Choppy/flat markets are rejected.</w:t>
+            </w:r>
+          </w:p>
+        </w:tc>
+      </w:tr>
+      <w:tr>
+        <w:tc>
+          <w:tcPr>
+            <w:tcW w:type="dxa" w:w="2400"/>
+            <w:tcBorders>
+              <w:top w:val="single" w:color="DDDDDD" w:sz="1"/>
+              <w:left w:val="single" w:color="DDDDDD" w:sz="1"/>
+              <w:bottom w:val="single" w:color="DDDDDD" w:sz="1"/>
+              <w:right w:val="single" w:color="DDDDDD" w:sz="1"/>
+            </w:tcBorders>
+            <w:shd w:fill="FFFFFF" w:val="clear"/>
+            <w:tcMar>
+              <w:top w:type="dxa" w:w="70"/>
+              <w:left w:type="dxa" w:w="120"/>
+              <w:bottom w:type="dxa" w:w="70"/>
+              <w:right w:type="dxa" w:w="120"/>
+            </w:tcMar>
+          </w:tcPr>
+          <w:p>
+            <w:r>
+              <w:rPr>
+                <w:b/>
+                <w:bCs/>
+                <w:sz w:val="20"/>
+                <w:szCs w:val="20"/>
+              </w:rPr>
+              <w:t xml:space="preserve">2. Lower highs</w:t>
+            </w:r>
+          </w:p>
+        </w:tc>
+        <w:tc>
+          <w:tcPr>
+            <w:tcW w:type="dxa" w:w="6960"/>
+            <w:tcBorders>
+              <w:top w:val="single" w:color="DDDDDD" w:sz="1"/>
+              <w:left w:val="single" w:color="DDDDDD" w:sz="1"/>
+              <w:bottom w:val="single" w:color="DDDDDD" w:sz="1"/>
+              <w:right w:val="single" w:color="DDDDDD" w:sz="1"/>
+            </w:tcBorders>
+            <w:shd w:fill="FFFFFF" w:val="clear"/>
+            <w:tcMar>
+              <w:top w:type="dxa" w:w="70"/>
+              <w:left w:type="dxa" w:w="120"/>
+              <w:bottom w:type="dxa" w:w="70"/>
+              <w:right w:type="dxa" w:w="120"/>
+            </w:tcMar>
+          </w:tcPr>
+          <w:p>
+            <w:r>
+              <w:rPr>
+                <w:sz w:val="20"/>
+                <w:szCs w:val="20"/>
+              </w:rPr>
+              <w:t xml:space="preserve">Three peaks, each lower than the last (H1 &gt; H2 &gt; H3) — the ceiling coming down.</w:t>
+            </w:r>
+          </w:p>
+        </w:tc>
+      </w:tr>
+      <w:tr>
+        <w:tc>
+          <w:tcPr>
+            <w:tcW w:type="dxa" w:w="2400"/>
+            <w:tcBorders>
+              <w:top w:val="single" w:color="DDDDDD" w:sz="1"/>
+              <w:left w:val="single" w:color="DDDDDD" w:sz="1"/>
+              <w:bottom w:val="single" w:color="DDDDDD" w:sz="1"/>
+              <w:right w:val="single" w:color="DDDDDD" w:sz="1"/>
+            </w:tcBorders>
+            <w:shd w:fill="F2F6FC" w:val="clear"/>
+            <w:tcMar>
+              <w:top w:type="dxa" w:w="70"/>
+              <w:left w:type="dxa" w:w="120"/>
+              <w:bottom w:type="dxa" w:w="70"/>
+              <w:right w:type="dxa" w:w="120"/>
+            </w:tcMar>
+          </w:tcPr>
+          <w:p>
+            <w:r>
+              <w:rPr>
+                <w:b/>
+                <w:bCs/>
+                <w:sz w:val="20"/>
+                <w:szCs w:val="20"/>
+              </w:rPr>
+              <w:t xml:space="preserve">3. Higher lows</w:t>
+            </w:r>
+          </w:p>
+        </w:tc>
+        <w:tc>
+          <w:tcPr>
+            <w:tcW w:type="dxa" w:w="6960"/>
+            <w:tcBorders>
+              <w:top w:val="single" w:color="DDDDDD" w:sz="1"/>
+              <w:left w:val="single" w:color="DDDDDD" w:sz="1"/>
+              <w:bottom w:val="single" w:color="DDDDDD" w:sz="1"/>
+              <w:right w:val="single" w:color="DDDDDD" w:sz="1"/>
+            </w:tcBorders>
+            <w:shd w:fill="F2F6FC" w:val="clear"/>
+            <w:tcMar>
+              <w:top w:type="dxa" w:w="70"/>
+              <w:left w:type="dxa" w:w="120"/>
+              <w:bottom w:type="dxa" w:w="70"/>
+              <w:right w:type="dxa" w:w="120"/>
+            </w:tcMar>
+          </w:tcPr>
+          <w:p>
+            <w:r>
+              <w:rPr>
+                <w:sz w:val="20"/>
+                <w:szCs w:val="20"/>
+              </w:rPr>
+              <w:t xml:space="preserve">Three dips, each higher than the last (L1 &lt; L2 &lt; L3) — the floor coming up.</w:t>
+            </w:r>
+          </w:p>
+        </w:tc>
+      </w:tr>
+      <w:tr>
+        <w:tc>
+          <w:tcPr>
+            <w:tcW w:type="dxa" w:w="2400"/>
+            <w:tcBorders>
+              <w:top w:val="single" w:color="DDDDDD" w:sz="1"/>
+              <w:left w:val="single" w:color="DDDDDD" w:sz="1"/>
+              <w:bottom w:val="single" w:color="DDDDDD" w:sz="1"/>
+              <w:right w:val="single" w:color="DDDDDD" w:sz="1"/>
+            </w:tcBorders>
+            <w:shd w:fill="FFFFFF" w:val="clear"/>
+            <w:tcMar>
+              <w:top w:type="dxa" w:w="70"/>
+              <w:left w:type="dxa" w:w="120"/>
+              <w:bottom w:type="dxa" w:w="70"/>
+              <w:right w:type="dxa" w:w="120"/>
+            </w:tcMar>
+          </w:tcPr>
+          <w:p>
+            <w:r>
+              <w:rPr>
+                <w:b/>
+                <w:bCs/>
+                <w:sz w:val="20"/>
+                <w:szCs w:val="20"/>
+              </w:rPr>
+              <w:t xml:space="preserve">4. Real squeeze</w:t>
+            </w:r>
+          </w:p>
+        </w:tc>
+        <w:tc>
+          <w:tcPr>
+            <w:tcW w:type="dxa" w:w="6960"/>
+            <w:tcBorders>
+              <w:top w:val="single" w:color="DDDDDD" w:sz="1"/>
+              <w:left w:val="single" w:color="DDDDDD" w:sz="1"/>
+              <w:bottom w:val="single" w:color="DDDDDD" w:sz="1"/>
+              <w:right w:val="single" w:color="DDDDDD" w:sz="1"/>
+            </w:tcBorders>
+            <w:shd w:fill="FFFFFF" w:val="clear"/>
+            <w:tcMar>
+              <w:top w:type="dxa" w:w="70"/>
+              <w:left w:type="dxa" w:w="120"/>
+              <w:bottom w:type="dxa" w:w="70"/>
+              <w:right w:type="dxa" w:w="120"/>
+            </w:tcMar>
+          </w:tcPr>
+          <w:p>
+            <w:r>
+              <w:rPr>
+                <w:sz w:val="20"/>
+                <w:szCs w:val="20"/>
+              </w:rPr>
+              <w:t xml:space="preserve">The funnel must tighten by at least 30% — its mouth shrinks to under 70% of its starting width.</w:t>
+            </w:r>
+          </w:p>
+        </w:tc>
+      </w:tr>
+      <w:tr>
+        <w:tc>
+          <w:tcPr>
+            <w:tcW w:type="dxa" w:w="2400"/>
+            <w:tcBorders>
+              <w:top w:val="single" w:color="DDDDDD" w:sz="1"/>
+              <w:left w:val="single" w:color="DDDDDD" w:sz="1"/>
+              <w:bottom w:val="single" w:color="DDDDDD" w:sz="1"/>
+              <w:right w:val="single" w:color="DDDDDD" w:sz="1"/>
+            </w:tcBorders>
+            <w:shd w:fill="F2F6FC" w:val="clear"/>
+            <w:tcMar>
+              <w:top w:type="dxa" w:w="70"/>
+              <w:left w:type="dxa" w:w="120"/>
+              <w:bottom w:type="dxa" w:w="70"/>
+              <w:right w:type="dxa" w:w="120"/>
+            </w:tcMar>
+          </w:tcPr>
+          <w:p>
+            <w:r>
+              <w:rPr>
+                <w:b/>
+                <w:bCs/>
+                <w:sz w:val="20"/>
+                <w:szCs w:val="20"/>
+              </w:rPr>
+              <w:t xml:space="preserve">5. Fresh breakout</w:t>
+            </w:r>
+          </w:p>
+        </w:tc>
+        <w:tc>
+          <w:tcPr>
+            <w:tcW w:type="dxa" w:w="6960"/>
+            <w:tcBorders>
+              <w:top w:val="single" w:color="DDDDDD" w:sz="1"/>
+              <w:left w:val="single" w:color="DDDDDD" w:sz="1"/>
+              <w:bottom w:val="single" w:color="DDDDDD" w:sz="1"/>
+              <w:right w:val="single" w:color="DDDDDD" w:sz="1"/>
+            </w:tcBorders>
+            <w:shd w:fill="F2F6FC" w:val="clear"/>
+            <w:tcMar>
+              <w:top w:type="dxa" w:w="70"/>
+              <w:left w:type="dxa" w:w="120"/>
+              <w:bottom w:type="dxa" w:w="70"/>
+              <w:right w:type="dxa" w:w="120"/>
+            </w:tcMar>
+          </w:tcPr>
+          <w:p>
+            <w:r>
+              <w:rPr>
+                <w:sz w:val="20"/>
+                <w:szCs w:val="20"/>
+              </w:rPr>
+              <w:t xml:space="preserve">The breakout pivot (H3 / L3) must have formed within the last 60 bars, not weeks ago.</w:t>
+            </w:r>
+          </w:p>
+        </w:tc>
+      </w:tr>
+      <w:tr>
+        <w:tc>
+          <w:tcPr>
+            <w:tcW w:type="dxa" w:w="2400"/>
+            <w:tcBorders>
+              <w:top w:val="single" w:color="DDDDDD" w:sz="1"/>
+              <w:left w:val="single" w:color="DDDDDD" w:sz="1"/>
+              <w:bottom w:val="single" w:color="DDDDDD" w:sz="1"/>
+              <w:right w:val="single" w:color="DDDDDD" w:sz="1"/>
+            </w:tcBorders>
+            <w:shd w:fill="FFFFFF" w:val="clear"/>
+            <w:tcMar>
+              <w:top w:type="dxa" w:w="70"/>
+              <w:left w:type="dxa" w:w="120"/>
+              <w:bottom w:type="dxa" w:w="70"/>
+              <w:right w:type="dxa" w:w="120"/>
+            </w:tcMar>
+          </w:tcPr>
+          <w:p>
+            <w:r>
+              <w:rPr>
+                <w:b/>
+                <w:bCs/>
+                <w:sz w:val="20"/>
+                <w:szCs w:val="20"/>
+              </w:rPr>
+              <w:t xml:space="preserve">Tradeable gate</w:t>
+            </w:r>
+          </w:p>
+        </w:tc>
+        <w:tc>
+          <w:tcPr>
+            <w:tcW w:type="dxa" w:w="6960"/>
+            <w:tcBorders>
+              <w:top w:val="single" w:color="DDDDDD" w:sz="1"/>
+              <w:left w:val="single" w:color="DDDDDD" w:sz="1"/>
+              <w:bottom w:val="single" w:color="DDDDDD" w:sz="1"/>
+              <w:right w:val="single" w:color="DDDDDD" w:sz="1"/>
+            </w:tcBorders>
+            <w:shd w:fill="FFFFFF" w:val="clear"/>
+            <w:tcMar>
+              <w:top w:type="dxa" w:w="70"/>
+              <w:left w:type="dxa" w:w="120"/>
+              <w:bottom w:type="dxa" w:w="70"/>
+              <w:right w:type="dxa" w:w="120"/>
+            </w:tcMar>
+          </w:tcPr>
+          <w:p>
+            <w:r>
+              <w:rPr>
+                <w:sz w:val="20"/>
+                <w:szCs w:val="20"/>
+              </w:rPr>
+              <w:t xml:space="preserve">Reward-to-risk must be at least 3 : 1, or the idea goes on the watch-list, not the trade list.</w:t>
+            </w:r>
+          </w:p>
+        </w:tc>
+      </w:tr>
+      <w:tr>
+        <w:tc>
+          <w:tcPr>
+            <w:tcW w:type="dxa" w:w="2400"/>
+            <w:tcBorders>
+              <w:top w:val="single" w:color="DDDDDD" w:sz="1"/>
+              <w:left w:val="single" w:color="DDDDDD" w:sz="1"/>
+              <w:bottom w:val="single" w:color="DDDDDD" w:sz="1"/>
+              <w:right w:val="single" w:color="DDDDDD" w:sz="1"/>
+            </w:tcBorders>
+            <w:shd w:fill="F2F6FC" w:val="clear"/>
+            <w:tcMar>
+              <w:top w:type="dxa" w:w="70"/>
+              <w:left w:type="dxa" w:w="120"/>
+              <w:bottom w:type="dxa" w:w="70"/>
+              <w:right w:type="dxa" w:w="120"/>
+            </w:tcMar>
+          </w:tcPr>
+          <w:p>
+            <w:r>
+              <w:rPr>
+                <w:b/>
+                <w:bCs/>
+                <w:sz w:val="20"/>
+                <w:szCs w:val="20"/>
+              </w:rPr>
+              <w:t xml:space="preserve">Publish gate</w:t>
+            </w:r>
+          </w:p>
+        </w:tc>
+        <w:tc>
+          <w:tcPr>
+            <w:tcW w:type="dxa" w:w="6960"/>
+            <w:tcBorders>
+              <w:top w:val="single" w:color="DDDDDD" w:sz="1"/>
+              <w:left w:val="single" w:color="DDDDDD" w:sz="1"/>
+              <w:bottom w:val="single" w:color="DDDDDD" w:sz="1"/>
+              <w:right w:val="single" w:color="DDDDDD" w:sz="1"/>
+            </w:tcBorders>
+            <w:shd w:fill="F2F6FC" w:val="clear"/>
+            <w:tcMar>
+              <w:top w:type="dxa" w:w="70"/>
+              <w:left w:type="dxa" w:w="120"/>
+              <w:bottom w:type="dxa" w:w="70"/>
+              <w:right w:type="dxa" w:w="120"/>
+            </w:tcMar>
+          </w:tcPr>
+          <w:p>
+            <w:r>
+              <w:rPr>
+                <w:sz w:val="20"/>
+                <w:szCs w:val="20"/>
+              </w:rPr>
+              <w:t xml:space="preserve">Pattern quality must be at least 70 / 100 to be published; weaker patterns stay internal.</w:t>
+            </w:r>
+          </w:p>
+        </w:tc>
+      </w:tr>
+    </w:tbl>
+    <w:p>
+      <w:pPr>
+        <w:spacing w:after="140" w:before="160"/>
+      </w:pPr>
+      <w:r>
+        <w:rPr>
+          <w:sz w:val="22"/>
+          <w:szCs w:val="22"/>
+        </w:rPr>
+        <w:t xml:space="preserve">Only when all five rules pass does the system measure up the trade; the two gates then decide whether it is tradeable and whether it is published. Everything is checked the same way every time.</w:t>
       </w:r>
     </w:p>
     <w:p>
@@ -406,6 +841,89 @@
           <w:szCs w:val="18"/>
         </w:rPr>
         <w:t xml:space="preserve">Reward-for-risk is the main driver; the signal’s readiness and the pattern’s quality settle ties.</w:t>
+      </w:r>
+    </w:p>
+    <w:p>
+      <w:pPr>
+        <w:pStyle w:val="Heading2"/>
+      </w:pPr>
+      <w:r>
+        <w:t xml:space="preserve">How the ranking is calculated</w:t>
+      </w:r>
+    </w:p>
+    <w:p>
+      <w:pPr>
+        <w:spacing w:after="140"/>
+      </w:pPr>
+      <w:r>
+        <w:rPr>
+          <w:sz w:val="22"/>
+          <w:szCs w:val="22"/>
+        </w:rPr>
+        <w:t xml:space="preserve">The ranking is a simple, fixed recipe — every idea is scored on three things, compared in this exact order:</w:t>
+      </w:r>
+    </w:p>
+    <w:p>
+      <w:pPr>
+        <w:pStyle w:val="ListParagraph"/>
+        <w:numPr>
+          <w:ilvl w:val="0"/>
+          <w:numId w:val="2"/>
+        </w:numPr>
+        <w:spacing w:after="80"/>
+      </w:pPr>
+      <w:r>
+        <w:rPr>
+          <w:sz w:val="22"/>
+          <w:szCs w:val="22"/>
+        </w:rPr>
+        <w:t xml:space="preserve">Reward-to-risk, highest first — the single biggest driver.</w:t>
+      </w:r>
+    </w:p>
+    <w:p>
+      <w:pPr>
+        <w:pStyle w:val="ListParagraph"/>
+        <w:numPr>
+          <w:ilvl w:val="0"/>
+          <w:numId w:val="2"/>
+        </w:numPr>
+        <w:spacing w:after="80"/>
+      </w:pPr>
+      <w:r>
+        <w:rPr>
+          <w:sz w:val="22"/>
+          <w:szCs w:val="22"/>
+        </w:rPr>
+        <w:t xml:space="preserve">Signal readiness — already breaking out (“triggered”) ranks above armed-and-ready, which ranks above still-developing.</w:t>
+      </w:r>
+    </w:p>
+    <w:p>
+      <w:pPr>
+        <w:pStyle w:val="ListParagraph"/>
+        <w:numPr>
+          <w:ilvl w:val="0"/>
+          <w:numId w:val="2"/>
+        </w:numPr>
+        <w:spacing w:after="80"/>
+      </w:pPr>
+      <w:r>
+        <w:rPr>
+          <w:sz w:val="22"/>
+          <w:szCs w:val="22"/>
+        </w:rPr>
+        <w:t xml:space="preserve">Pattern quality (0–100), highest first — used to settle any remaining ties.</w:t>
+      </w:r>
+    </w:p>
+    <w:p>
+      <w:pPr>
+        <w:spacing w:after="140"/>
+      </w:pPr>
+      <w:r>
+        <w:rPr>
+          <w:sz w:val="22"/>
+          <w:szCs w:val="22"/>
+        </w:rPr>
+        <w:t xml:space="preserve">In other words: sort everything by reward-to-risk; where two ideas are level, the more ready one wins; and where they are still level, the cleaner pattern wins. The same recipe orders every list — the daily Slack report, the drafts, and the public picks — so nothing is ranked differently in different places.</w:t>
       </w:r>
     </w:p>
     <w:p>

</xml_diff>

<commit_message>
Trading filter gating + Scanner re-render fixes, doc corrections
</commit_message>
<xml_diff>
--- a/docs/How_The_Trading_System_Works_PlainEnglish.docx
+++ b/docs/How_The_Trading_System_Works_PlainEnglish.docx
@@ -43,7 +43,7 @@
           <w:sz w:val="22"/>
           <w:szCs w:val="22"/>
         </w:rPr>
-        <w:t xml:space="preserve">June 2026</w:t>
+        <w:t xml:space="preserve">June 2026 (numbers checked and corrected against the live system 11 August 2026)</w:t>
       </w:r>
     </w:p>
     <w:p>
@@ -108,7 +108,7 @@
           <w:sz w:val="22"/>
           <w:szCs w:val="22"/>
         </w:rPr>
-        <w:t xml:space="preserve">The method we use is called the Hunt Volatility Funnel. The idea is simple to picture. After a market has had a strong run in one direction, it often pauses and “coils” — the price swings get smaller and smaller, squeezing into a tightening funnel, like a spring being wound up. When the spring finally releases, the price often moves quickly in the direction of the original trend.</w:t>
+        <w:t xml:space="preserve">The method we use is called The Squeeze. The idea is simple to picture. After a market has had a strong run in one direction, it often pauses and “coils” — the price swings get smaller and smaller, squeezing into a tighter and tighter range, like a spring being wound up. When the spring finally releases, the price often moves quickly in the direction of the original trend.</w:t>
       </w:r>
     </w:p>
     <w:p>
@@ -121,7 +121,7 @@
           <wp:inline distT="0" distB="0" distL="0" distR="0">
             <wp:extent cx="5334000" cy="2895600"/>
             <wp:effectExtent t="0" r="0" b="0" l="0"/>
-            <wp:docPr id="1" name="hvf_funnel.png" descr="The funnel pattern" title="The funnel pattern"/>
+            <wp:docPr id="1" name="hvf_funnel.png" descr="The squeeze pattern" title="The squeeze pattern"/>
             <wp:cNvGraphicFramePr>
               <a:graphicFrameLocks xmlns:a="http://schemas.openxmlformats.org/drawingml/2006/main" noChangeAspect="1"/>
             </wp:cNvGraphicFramePr>
@@ -170,7 +170,7 @@
           <w:sz w:val="18"/>
           <w:szCs w:val="18"/>
         </w:rPr>
-        <w:t xml:space="preserve">The funnel: the ceiling (red) drifts down while the floor (green) rises, squeezing price to a point. The system marks where to get in, where the safety exit (stop) sits, and a realistic target.</w:t>
+        <w:t xml:space="preserve">The squeeze: the ceiling (red) drifts down while the floor (green) rises, squeezing price to a point. The system marks where to get in, where the safety exit (stop) sits, and a realistic target.</w:t>
       </w:r>
     </w:p>
     <w:p>
@@ -214,7 +214,7 @@
           <w:sz w:val="22"/>
           <w:szCs w:val="22"/>
         </w:rPr>
-        <w:t xml:space="preserve">Every funnel has a height: the distance from the first high to the first low of the squeeze. The method calls this the amplitude, or AMP1 (you can see it marked on the picture above). When the spring releases, the system projects that FULL height from the middle of the funnel, in the breakout direction, to set the target. It uses the full amplitude — not a watered-down version — which is deliberate, and it is why some setups show a large reward-to-risk.</w:t>
+        <w:t xml:space="preserve">Every squeeze has a height: the distance from the first high to the first low of the coil. The method calls this the amplitude, or AMP1 (you can see it marked on the picture above). When the spring releases, the system projects that FULL height from the middle of the squeeze, in the breakout direction, to set the target. It uses the full amplitude — not a watered-down version — which is deliberate, and it is why some setups show a large reward-to-risk.</w:t>
       </w:r>
     </w:p>
     <w:p>
@@ -226,7 +226,7 @@
           <w:sz w:val="22"/>
           <w:szCs w:val="22"/>
         </w:rPr>
-        <w:t xml:space="preserve">So the three trade levels come straight from the funnel: the entry is the breakout level itself (the third pivot); the safety exit (stop) sits just beyond the opposite side of the funnel; and the target is one full AMP1 away from the middle. Reward-to-risk is then simply the distance to the target divided by the distance to the stop.</w:t>
+        <w:t xml:space="preserve">So the three trade levels come straight from the squeeze: the entry is the breakout level itself (the third pivot); the safety exit (stop) sits just beyond the opposite side of the coil; and the target is one full AMP1 away from the middle. Reward-to-risk is then simply the distance to the target divided by the distance to the stop.</w:t>
       </w:r>
     </w:p>
     <w:p>
@@ -383,7 +383,7 @@
                 <w:sz w:val="20"/>
                 <w:szCs w:val="20"/>
               </w:rPr>
-              <w:t xml:space="preserve">A confirmed weekly trend in the trade's direction (up for a bullish funnel, down for bearish). Choppy/flat markets are rejected.</w:t>
+              <w:t xml:space="preserve">A confirmed weekly trend in the trade's direction (up for a bullish squeeze, down for bearish). Choppy/flat markets are rejected.</w:t>
             </w:r>
           </w:p>
         </w:tc>
@@ -557,7 +557,7 @@
                 <w:sz w:val="20"/>
                 <w:szCs w:val="20"/>
               </w:rPr>
-              <w:t xml:space="preserve">The funnel must tighten by at least 30% — its mouth shrinks to under 70% of its starting width.</w:t>
+              <w:t xml:space="preserve">The coil must tighten to under 35% of its starting width — a squeeze at least 65% tighter than where it started.</w:t>
             </w:r>
           </w:p>
         </w:tc>
@@ -731,7 +731,7 @@
                 <w:sz w:val="20"/>
                 <w:szCs w:val="20"/>
               </w:rPr>
-              <w:t xml:space="preserve">Pattern quality must be at least 70 / 100 to be published; weaker patterns stay internal.</w:t>
+              <w:t xml:space="preserve">Pattern quality must be at least 25 / 100 to be published; weaker patterns stay internal.</w:t>
             </w:r>
           </w:p>
         </w:tc>
@@ -1433,7 +1433,7 @@
                 <w:sz w:val="20"/>
                 <w:szCs w:val="20"/>
               </w:rPr>
-              <w:t xml:space="preserve">The funnel (HVF)</w:t>
+              <w:t xml:space="preserve">The Squeeze</w:t>
             </w:r>
           </w:p>
         </w:tc>

</xml_diff>